<commit_message>
Ajout élèment manquant régle du pluriel
</commit_message>
<xml_diff>
--- a/Cours/6eme/SaintExupery/Chapitre_1_1/Documents/Chapitre 1 - Partie 1 - Nombres entiers (A trou).docx
+++ b/Cours/6eme/SaintExupery/Chapitre_1_1/Documents/Chapitre 1 - Partie 1 - Nombres entiers (A trou).docx
@@ -4298,9 +4298,9 @@
         <mc:AlternateContent>
           <mc:Choice Requires="wps">
             <w:drawing>
-              <wp:inline distT="0" distB="0" distL="0" distR="0" wp14:anchorId="7FC34041" wp14:editId="4491E00C">
-                <wp:extent cx="6372000" cy="1905000"/>
-                <wp:effectExtent l="57150" t="57150" r="10160" b="19050"/>
+              <wp:inline distT="0" distB="0" distL="0" distR="0" wp14:anchorId="7FC34041" wp14:editId="568B3DBC">
+                <wp:extent cx="6372000" cy="3255394"/>
+                <wp:effectExtent l="57150" t="57150" r="10160" b="21590"/>
                 <wp:docPr id="12" name="Zone de texte 2"/>
                 <wp:cNvGraphicFramePr>
                   <a:graphicFrameLocks xmlns:a="http://schemas.openxmlformats.org/drawingml/2006/main"/>
@@ -4314,7 +4314,7 @@
                       <wps:spPr bwMode="auto">
                         <a:xfrm>
                           <a:off x="0" y="0"/>
-                          <a:ext cx="6372000" cy="1905000"/>
+                          <a:ext cx="6372000" cy="3255394"/>
                         </a:xfrm>
                         <a:prstGeom prst="rect">
                           <a:avLst/>
@@ -4391,6 +4391,38 @@
                               </w:rPr>
                               <w:tab/>
                             </w:r>
+                            <w:r>
+                              <w:rPr>
+                                <w:rFonts w:ascii="Cambria Math" w:hAnsi="Cambria Math"/>
+                                <w:color w:val="000000" w:themeColor="text1"/>
+                                <w:u w:val="dash"/>
+                              </w:rPr>
+                              <w:tab/>
+                            </w:r>
+                            <w:r>
+                              <w:rPr>
+                                <w:rFonts w:ascii="Cambria Math" w:hAnsi="Cambria Math"/>
+                                <w:color w:val="000000" w:themeColor="text1"/>
+                                <w:u w:val="dash"/>
+                              </w:rPr>
+                              <w:tab/>
+                            </w:r>
+                            <w:r>
+                              <w:rPr>
+                                <w:rFonts w:ascii="Cambria Math" w:hAnsi="Cambria Math"/>
+                                <w:color w:val="000000" w:themeColor="text1"/>
+                                <w:u w:val="dash"/>
+                              </w:rPr>
+                              <w:tab/>
+                            </w:r>
+                            <w:r>
+                              <w:rPr>
+                                <w:rFonts w:ascii="Cambria Math" w:hAnsi="Cambria Math"/>
+                                <w:color w:val="000000" w:themeColor="text1"/>
+                                <w:u w:val="dash"/>
+                              </w:rPr>
+                              <w:tab/>
+                            </w:r>
                           </w:p>
                         </w:txbxContent>
                       </wps:txbx>
@@ -4405,7 +4437,11 @@
           </mc:Choice>
           <mc:Fallback>
             <w:pict>
-              <v:shape w14:anchorId="7FC34041" id="_x0000_s1028" type="#_x0000_t202" style="width:501.75pt;height:150pt;visibility:visible;mso-wrap-style:square;mso-left-percent:-10001;mso-top-percent:-10001;mso-position-horizontal:absolute;mso-position-horizontal-relative:char;mso-position-vertical:absolute;mso-position-vertical-relative:line;mso-left-percent:-10001;mso-top-percent:-10001;v-text-anchor:top" o:gfxdata="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" strokeweight="1pt">
+              <v:shapetype w14:anchorId="7FC34041" id="_x0000_t202" coordsize="21600,21600" o:spt="202" path="m,l,21600r21600,l21600,xe">
+                <v:stroke joinstyle="miter"/>
+                <v:path gradientshapeok="t" o:connecttype="rect"/>
+              </v:shapetype>
+              <v:shape id="_x0000_s1028" type="#_x0000_t202" style="width:501.75pt;height:256.35pt;visibility:visible;mso-wrap-style:square;mso-left-percent:-10001;mso-top-percent:-10001;mso-position-horizontal:absolute;mso-position-horizontal-relative:char;mso-position-vertical:absolute;mso-position-vertical-relative:line;mso-left-percent:-10001;mso-top-percent:-10001;v-text-anchor:top" o:gfxdata="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" strokeweight="1pt">
                 <v:stroke linestyle="thinThin"/>
                 <v:shadow on="t" color="#d8d8d8 [2732]" origin=".5,.5" offset="-1.24725mm,-1.24725mm"/>
                 <v:textbox>
@@ -4432,6 +4468,38 @@
                       <w:r>
                         <w:rPr>
                           <w:rFonts w:ascii="Cambria Math" w:hAnsi="Cambria Math"/>
+                          <w:u w:val="dash"/>
+                        </w:rPr>
+                        <w:tab/>
+                      </w:r>
+                      <w:r>
+                        <w:rPr>
+                          <w:rFonts w:ascii="Cambria Math" w:hAnsi="Cambria Math"/>
+                          <w:color w:val="000000" w:themeColor="text1"/>
+                          <w:u w:val="dash"/>
+                        </w:rPr>
+                        <w:tab/>
+                      </w:r>
+                      <w:r>
+                        <w:rPr>
+                          <w:rFonts w:ascii="Cambria Math" w:hAnsi="Cambria Math"/>
+                          <w:color w:val="000000" w:themeColor="text1"/>
+                          <w:u w:val="dash"/>
+                        </w:rPr>
+                        <w:tab/>
+                      </w:r>
+                      <w:r>
+                        <w:rPr>
+                          <w:rFonts w:ascii="Cambria Math" w:hAnsi="Cambria Math"/>
+                          <w:color w:val="000000" w:themeColor="text1"/>
+                          <w:u w:val="dash"/>
+                        </w:rPr>
+                        <w:tab/>
+                      </w:r>
+                      <w:r>
+                        <w:rPr>
+                          <w:rFonts w:ascii="Cambria Math" w:hAnsi="Cambria Math"/>
+                          <w:color w:val="000000" w:themeColor="text1"/>
                           <w:u w:val="dash"/>
                         </w:rPr>
                         <w:tab/>

</xml_diff>